<commit_message>
Documentation cover: add student names and IDs
Co-Authored-By: Claude Sonnet 5.5 <noreply@anthropic.com>
</commit_message>
<xml_diff>
--- a/docs/MT_Alchemy_Documentation_25pages.docx
+++ b/docs/MT_Alchemy_Documentation_25pages.docx
@@ -419,6 +419,80 @@
                 <w:szCs w:val="18"/>
               </w:rPr>
               <w:t xml:space="preserve">: Authentication, Cloud Firestore (asia-southeast1)</w:t>
+            </w:r>
+          </w:p>
+        </w:tc>
+      </w:tr>
+      <w:tr>
+        <w:trPr>
+          <w:cantSplit/>
+          <w:tblHeader w:val="off"/>
+        </w:trPr>
+        <w:tc>
+          <w:tcPr>
+            <w:tcW w:type="dxa" w:w="3252"/>
+            <w:tcBorders>
+              <w:top w:val="single" w:color="D4D4D8" w:sz="4"/>
+              <w:left w:val="single" w:color="D4D4D8" w:sz="4"/>
+              <w:bottom w:val="single" w:color="D4D4D8" w:sz="4"/>
+              <w:right w:val="single" w:color="D4D4D8" w:sz="4"/>
+            </w:tcBorders>
+            <w:tcMar>
+              <w:top w:type="dxa" w:w="60"/>
+              <w:left w:type="dxa" w:w="100"/>
+              <w:bottom w:type="dxa" w:w="60"/>
+              <w:right w:type="dxa" w:w="100"/>
+            </w:tcMar>
+            <w:vAlign w:val="top"/>
+          </w:tcPr>
+          <w:p>
+            <w:pPr>
+              <w:spacing w:after="0"/>
+            </w:pPr>
+            <w:r>
+              <w:rPr>
+                <w:b/>
+                <w:bCs/>
+                <w:i w:val="false"/>
+                <w:iCs w:val="false"/>
+                <w:sz w:val="18"/>
+                <w:szCs w:val="18"/>
+              </w:rPr>
+              <w:t xml:space="preserve">Students</w:t>
+            </w:r>
+          </w:p>
+        </w:tc>
+        <w:tc>
+          <w:tcPr>
+            <w:tcW w:type="dxa" w:w="6386"/>
+            <w:tcBorders>
+              <w:top w:val="single" w:color="D4D4D8" w:sz="4"/>
+              <w:left w:val="single" w:color="D4D4D8" w:sz="4"/>
+              <w:bottom w:val="single" w:color="D4D4D8" w:sz="4"/>
+              <w:right w:val="single" w:color="D4D4D8" w:sz="4"/>
+            </w:tcBorders>
+            <w:tcMar>
+              <w:top w:type="dxa" w:w="60"/>
+              <w:left w:type="dxa" w:w="100"/>
+              <w:bottom w:type="dxa" w:w="60"/>
+              <w:right w:type="dxa" w:w="100"/>
+            </w:tcMar>
+            <w:vAlign w:val="top"/>
+          </w:tcPr>
+          <w:p>
+            <w:pPr>
+              <w:spacing w:after="0"/>
+            </w:pPr>
+            <w:r>
+              <w:rPr>
+                <w:b w:val="false"/>
+                <w:bCs w:val="false"/>
+                <w:i w:val="false"/>
+                <w:iCs w:val="false"/>
+                <w:sz w:val="18"/>
+                <w:szCs w:val="18"/>
+              </w:rPr>
+              <w:t xml:space="preserve">AJAY A N (I26043131) · TANUJ SAKTHI KUMAR (I26043130) · MAAHIR FAHEEM (I26043132)</w:t>
             </w:r>
           </w:p>
         </w:tc>

</xml_diff>